<commit_message>
Correct 솔브레인홀딩스·한화머시너리 classification against disclosure data
- 한화머시너리앤서비스홀딩스: 산업기계가 아니라 2026-08-01 (주)한화
  인적분할 신설 지주. 한화비전 → 한화세미텍(HBM TC본더) 2단 룩스루가
  주력이므로 팀 2 → 팀 1, 테마 반도체·AI
- (주)한화: 같은 분할로 모멘텀·비전이 이탈, 자체 사업은 화약·유도무기와
  건설만 남음 → 테마 방산·건설
- 솔브레인홀딩스: 순수지주(2020 인적분할 투자사업부문). 솔브레인 44.9%,
  바이오헬스케어 연결 매출 11%
- 팀 비중 17.32 / 16.87 / 15.36%

DART 접근이 차단되어 KRX·증권정보 2차 자료로 확인. 솔브레인홀딩스
바이오헬스케어의 직접 영위 여부는 사업보고서 원문 확인이 필요하다.

Co-Authored-By: Claude Opus 5 <noreply@anthropic.com>
Claude-Session: https://claude.ai/code/session_014jphTyMQLHbxpFNoQ68jkL
</commit_message>
<xml_diff>
--- a/docs/26-2/data/ICOK_담당산업_배정시트_20260915.docx
+++ b/docs/26-2/data/ICOK_담당산업_배정시트_20260915.docx
@@ -26,7 +26,7 @@
           <w:color w:val="555555"/>
           <w:sz w:val="18"/>
         </w:rPr>
-        <w:t>팀장 배준서 · 6명   |   팀 예산 4,845,877원 (벤치마크 17.31%)   |   2026-09-15 종가 기준 · NAV 28,000,000원</w:t>
+        <w:t>팀장 배준서 · 6명   |   팀 예산 4,849,019원 (벤치마크 17.32%)   |   2026-09-15 종가 기준 · NAV 28,000,000원</w:t>
       </w:r>
     </w:p>
     <w:p>
@@ -522,7 +522,7 @@
                 <w:b w:val="0"/>
                 <w:sz w:val="18"/>
               </w:rPr>
-              <w:t>2.96%</w:t>
+              <w:t>2.98%</w:t>
             </w:r>
           </w:p>
         </w:tc>
@@ -542,7 +542,7 @@
                 <w:b w:val="0"/>
                 <w:sz w:val="18"/>
               </w:rPr>
-              <w:t>830,050원</w:t>
+              <w:t>833,191원</w:t>
             </w:r>
           </w:p>
         </w:tc>
@@ -562,7 +562,7 @@
                 <w:b w:val="0"/>
                 <w:sz w:val="18"/>
               </w:rPr>
-              <w:t>6</w:t>
+              <w:t>7</w:t>
             </w:r>
           </w:p>
         </w:tc>
@@ -582,7 +582,7 @@
                 <w:b w:val="0"/>
                 <w:sz w:val="18"/>
               </w:rPr>
-              <w:t>24,200원</w:t>
+              <w:t>7,070원</w:t>
             </w:r>
           </w:p>
         </w:tc>
@@ -1500,7 +1500,7 @@
           <w:color w:val="555555"/>
           <w:sz w:val="18"/>
         </w:rPr>
-        <w:t>팀장 이재우 · 5명   |   팀 예산 4,726,042원 (벤치마크 16.88%)   |   2026-09-15 종가 기준 · NAV 28,000,000원</w:t>
+        <w:t>팀장 이재우 · 5명   |   팀 예산 4,722,901원 (벤치마크 16.87%)   |   2026-09-15 종가 기준 · NAV 28,000,000원</w:t>
       </w:r>
     </w:p>
     <w:p>
@@ -2270,7 +2270,7 @@
                 <w:b w:val="0"/>
                 <w:sz w:val="18"/>
               </w:rPr>
-              <w:t>2.24%</w:t>
+              <w:t>2.23%</w:t>
             </w:r>
           </w:p>
         </w:tc>
@@ -2290,7 +2290,7 @@
                 <w:b w:val="0"/>
                 <w:sz w:val="18"/>
               </w:rPr>
-              <w:t>626,571원</w:t>
+              <w:t>623,430원</w:t>
             </w:r>
           </w:p>
         </w:tc>
@@ -2310,7 +2310,7 @@
                 <w:b w:val="0"/>
                 <w:sz w:val="18"/>
               </w:rPr>
-              <w:t>11</w:t>
+              <w:t>10</w:t>
             </w:r>
           </w:p>
         </w:tc>
@@ -2330,7 +2330,7 @@
                 <w:b w:val="0"/>
                 <w:sz w:val="18"/>
               </w:rPr>
-              <w:t>7,070원</w:t>
+              <w:t>11,240원</w:t>
             </w:r>
           </w:p>
         </w:tc>

</xml_diff>